<commit_message>
Docs: Added details about llm model state persistence and training pipeline
</commit_message>
<xml_diff>
--- a/docs/freecad-ai-detailed-playbook.docx
+++ b/docs/freecad-ai-detailed-playbook.docx
@@ -4579,6 +4579,58 @@
       </w:pPr>
       <w:r>
         <w:t>key functions: _load_jobs_module, test_llm_runtime_budget_stays_within_job_timeout, test_run_repair_loop_job_uses_context_aware_llm_budget_without_token_cap, test_llm_runtime_budget_uses_context_window_without_app_side_token_request • size: 2,310 bytes</w:t>
+      </w:r>
+    </w:p>
+    <w:p>
+      <w:pPr>
+        <w:pStyle w:val="Heading1"/>
+      </w:pPr>
+      <w:r>
+        <w:t>Updates: Persistent LLM State &amp; Training Pipeline</w:t>
+      </w:r>
+    </w:p>
+    <w:p>
+      <w:r>
+        <w:t>This version of the repository introduces persistent model state storage and an in-repo training pipeline.</w:t>
+        <w:br/>
+        <w:br/>
+        <w:t>New behavior:</w:t>
+        <w:br/>
+        <w:t>- Model state (checkpoint, weights, LoRA adapter, optimizer state, embedding index) is stored under data/llm/state/.</w:t>
+        <w:br/>
+        <w:t>- This directory is mounted via docker-compose using configurable variables (LLM_STATE_DIR, LLM_STATE_HOST_DIR).</w:t>
+        <w:br/>
+        <w:t>- The worker loads the latest persisted state (latest.json) and injects inference_profile.json into LLM requests.</w:t>
+        <w:br/>
+        <w:t>- A new training pipeline (tools/train_llm_state.py) generates reusable state bundles.</w:t>
+        <w:br/>
+        <w:br/>
+        <w:t>New files:</w:t>
+        <w:br/>
+        <w:t>- services/freecad-worker/worker/model_state.py</w:t>
+        <w:br/>
+        <w:t>- tools/train_llm_state.py</w:t>
+        <w:br/>
+        <w:t>- tests covering persistence, training, and docker-compose wiring</w:t>
+        <w:br/>
+        <w:br/>
+        <w:t>Updated files:</w:t>
+        <w:br/>
+        <w:t>- docker-compose.yml</w:t>
+        <w:br/>
+        <w:t>- services/freecad-worker/worker/llm.py</w:t>
+        <w:br/>
+        <w:t>- services/freecad-worker/worker/settings.py</w:t>
+        <w:br/>
+        <w:t>- README.md, docs/testing.md</w:t>
+        <w:br/>
+        <w:br/>
+        <w:t>Impact:</w:t>
+        <w:br/>
+        <w:t>- Model behavior can persist across container rebuilds via mounted volumes.</w:t>
+        <w:br/>
+        <w:t>- Training artifacts can be reused without retraining.</w:t>
+        <w:br/>
       </w:r>
     </w:p>
     <w:sectPr>

</xml_diff>